<commit_message>
laprak sudah jadi bosku
</commit_message>
<xml_diff>
--- a/Laporan.docx
+++ b/Laporan.docx
@@ -772,7 +772,7 @@
           <w:szCs w:val="44"/>
         </w:rPr>
         <w:drawing>
-          <wp:anchor distT="0" distB="0" distL="114300" distR="114300" simplePos="0" relativeHeight="251667456" behindDoc="0" locked="0" layoutInCell="1" allowOverlap="1" wp14:anchorId="2B1F11C1" wp14:editId="39F862DD">
+          <wp:anchor distT="0" distB="0" distL="114300" distR="114300" simplePos="0" relativeHeight="251667456" behindDoc="0" locked="0" layoutInCell="1" allowOverlap="1" wp14:anchorId="2B1F11C1" wp14:editId="18F8EBF1">
             <wp:simplePos x="0" y="0"/>
             <wp:positionH relativeFrom="column">
               <wp:posOffset>-30480</wp:posOffset>
@@ -969,7 +969,7 @@
                                     <pic:cNvPicPr/>
                                   </pic:nvPicPr>
                                   <pic:blipFill>
-                                    <a:blip r:embed="rId8"/>
+                                    <a:blip r:embed="rId9"/>
                                     <a:stretch>
                                       <a:fillRect/>
                                     </a:stretch>
@@ -1041,6 +1041,7 @@
       <w:r>
         <w:rPr>
           <w:rFonts w:ascii="Times New Roman" w:hAnsi="Times New Roman" w:cs="Times New Roman"/>
+          <w:noProof/>
           <w:sz w:val="44"/>
           <w:szCs w:val="44"/>
         </w:rPr>
@@ -1060,7 +1061,7 @@
                     <pic:cNvPicPr/>
                   </pic:nvPicPr>
                   <pic:blipFill>
-                    <a:blip r:embed="rId9"/>
+                    <a:blip r:embed="rId10"/>
                     <a:stretch>
                       <a:fillRect/>
                     </a:stretch>
@@ -1093,6 +1094,7 @@
       <w:r>
         <w:rPr>
           <w:rFonts w:ascii="Times New Roman" w:hAnsi="Times New Roman" w:cs="Times New Roman"/>
+          <w:noProof/>
           <w:sz w:val="44"/>
           <w:szCs w:val="44"/>
         </w:rPr>
@@ -1112,7 +1114,7 @@
                     <pic:cNvPicPr/>
                   </pic:nvPicPr>
                   <pic:blipFill>
-                    <a:blip r:embed="rId10"/>
+                    <a:blip r:embed="rId11"/>
                     <a:stretch>
                       <a:fillRect/>
                     </a:stretch>
@@ -1183,6 +1185,7 @@
       <w:r>
         <w:rPr>
           <w:rFonts w:ascii="Times New Roman" w:hAnsi="Times New Roman" w:cs="Times New Roman"/>
+          <w:noProof/>
           <w:sz w:val="44"/>
           <w:szCs w:val="44"/>
         </w:rPr>
@@ -1202,7 +1205,7 @@
                     <pic:cNvPicPr/>
                   </pic:nvPicPr>
                   <pic:blipFill>
-                    <a:blip r:embed="rId11"/>
+                    <a:blip r:embed="rId12"/>
                     <a:stretch>
                       <a:fillRect/>
                     </a:stretch>
@@ -1225,6 +1228,7 @@
       <w:r>
         <w:rPr>
           <w:rFonts w:ascii="Times New Roman" w:hAnsi="Times New Roman" w:cs="Times New Roman"/>
+          <w:noProof/>
           <w:sz w:val="44"/>
           <w:szCs w:val="44"/>
         </w:rPr>
@@ -1244,7 +1248,7 @@
                     <pic:cNvPicPr/>
                   </pic:nvPicPr>
                   <pic:blipFill>
-                    <a:blip r:embed="rId12"/>
+                    <a:blip r:embed="rId13"/>
                     <a:stretch>
                       <a:fillRect/>
                     </a:stretch>
@@ -1267,6 +1271,7 @@
       <w:r>
         <w:rPr>
           <w:rFonts w:ascii="Times New Roman" w:hAnsi="Times New Roman" w:cs="Times New Roman"/>
+          <w:noProof/>
           <w:sz w:val="44"/>
           <w:szCs w:val="44"/>
         </w:rPr>
@@ -1286,7 +1291,7 @@
                     <pic:cNvPicPr/>
                   </pic:nvPicPr>
                   <pic:blipFill>
-                    <a:blip r:embed="rId13"/>
+                    <a:blip r:embed="rId14"/>
                     <a:stretch>
                       <a:fillRect/>
                     </a:stretch>
@@ -1309,6 +1314,7 @@
       <w:r>
         <w:rPr>
           <w:rFonts w:ascii="Times New Roman" w:hAnsi="Times New Roman" w:cs="Times New Roman"/>
+          <w:noProof/>
           <w:sz w:val="44"/>
           <w:szCs w:val="44"/>
         </w:rPr>
@@ -1328,7 +1334,7 @@
                     <pic:cNvPicPr/>
                   </pic:nvPicPr>
                   <pic:blipFill>
-                    <a:blip r:embed="rId14"/>
+                    <a:blip r:embed="rId15"/>
                     <a:stretch>
                       <a:fillRect/>
                     </a:stretch>
@@ -1379,6 +1385,7 @@
       <w:r>
         <w:rPr>
           <w:rFonts w:ascii="Times New Roman" w:hAnsi="Times New Roman" w:cs="Times New Roman"/>
+          <w:noProof/>
           <w:sz w:val="44"/>
           <w:szCs w:val="44"/>
         </w:rPr>
@@ -1398,7 +1405,7 @@
                     <pic:cNvPicPr/>
                   </pic:nvPicPr>
                   <pic:blipFill>
-                    <a:blip r:embed="rId15"/>
+                    <a:blip r:embed="rId16"/>
                     <a:stretch>
                       <a:fillRect/>
                     </a:stretch>
@@ -1421,6 +1428,7 @@
       <w:r>
         <w:rPr>
           <w:rFonts w:ascii="Times New Roman" w:hAnsi="Times New Roman" w:cs="Times New Roman"/>
+          <w:noProof/>
           <w:sz w:val="44"/>
           <w:szCs w:val="44"/>
         </w:rPr>
@@ -1440,7 +1448,7 @@
                     <pic:cNvPicPr/>
                   </pic:nvPicPr>
                   <pic:blipFill>
-                    <a:blip r:embed="rId16"/>
+                    <a:blip r:embed="rId17"/>
                     <a:stretch>
                       <a:fillRect/>
                     </a:stretch>
@@ -1463,6 +1471,7 @@
       <w:r>
         <w:rPr>
           <w:rFonts w:ascii="Times New Roman" w:hAnsi="Times New Roman" w:cs="Times New Roman"/>
+          <w:noProof/>
           <w:sz w:val="44"/>
           <w:szCs w:val="44"/>
         </w:rPr>
@@ -1482,7 +1491,7 @@
                     <pic:cNvPicPr/>
                   </pic:nvPicPr>
                   <pic:blipFill>
-                    <a:blip r:embed="rId17"/>
+                    <a:blip r:embed="rId18"/>
                     <a:stretch>
                       <a:fillRect/>
                     </a:stretch>
@@ -1535,6 +1544,7 @@
       <w:r>
         <w:rPr>
           <w:rFonts w:ascii="Times New Roman" w:hAnsi="Times New Roman" w:cs="Times New Roman"/>
+          <w:noProof/>
           <w:sz w:val="44"/>
           <w:szCs w:val="44"/>
         </w:rPr>
@@ -1554,7 +1564,7 @@
                     <pic:cNvPicPr/>
                   </pic:nvPicPr>
                   <pic:blipFill>
-                    <a:blip r:embed="rId18"/>
+                    <a:blip r:embed="rId19"/>
                     <a:stretch>
                       <a:fillRect/>
                     </a:stretch>
@@ -1577,6 +1587,7 @@
       <w:r>
         <w:rPr>
           <w:rFonts w:ascii="Times New Roman" w:hAnsi="Times New Roman" w:cs="Times New Roman"/>
+          <w:noProof/>
           <w:sz w:val="44"/>
           <w:szCs w:val="44"/>
         </w:rPr>
@@ -1596,7 +1607,7 @@
                     <pic:cNvPicPr/>
                   </pic:nvPicPr>
                   <pic:blipFill>
-                    <a:blip r:embed="rId19"/>
+                    <a:blip r:embed="rId20"/>
                     <a:stretch>
                       <a:fillRect/>
                     </a:stretch>
@@ -1664,7 +1675,7 @@
                     <pic:cNvPicPr/>
                   </pic:nvPicPr>
                   <pic:blipFill>
-                    <a:blip r:embed="rId20"/>
+                    <a:blip r:embed="rId21"/>
                     <a:stretch>
                       <a:fillRect/>
                     </a:stretch>
@@ -1704,7 +1715,7 @@
                     <pic:cNvPicPr/>
                   </pic:nvPicPr>
                   <pic:blipFill>
-                    <a:blip r:embed="rId21"/>
+                    <a:blip r:embed="rId22"/>
                     <a:stretch>
                       <a:fillRect/>
                     </a:stretch>
@@ -1744,22 +1755,246 @@
       <w:r>
         <w:rPr>
           <w:rFonts w:ascii="Times New Roman" w:hAnsi="Times New Roman" w:cs="Times New Roman"/>
+          <w:b/>
+          <w:bCs/>
           <w:sz w:val="44"/>
           <w:szCs w:val="44"/>
         </w:rPr>
         <w:lastRenderedPageBreak/>
+        <w:t>Soal 8</w:t>
+      </w:r>
+    </w:p>
+    <w:p>
+      <w:pPr>
+        <w:rPr>
+          <w:rFonts w:ascii="Times New Roman" w:hAnsi="Times New Roman" w:cs="Times New Roman"/>
+          <w:sz w:val="44"/>
+          <w:szCs w:val="44"/>
+        </w:rPr>
+      </w:pPr>
+      <w:r>
+        <w:rPr>
+          <w:rFonts w:ascii="Times New Roman" w:hAnsi="Times New Roman" w:cs="Times New Roman"/>
+          <w:sz w:val="44"/>
+          <w:szCs w:val="44"/>
+        </w:rPr>
+        <w:drawing>
+          <wp:inline distT="0" distB="0" distL="0" distR="0" wp14:anchorId="471ED168" wp14:editId="1281A94E">
+            <wp:extent cx="4526280" cy="5087928"/>
+            <wp:effectExtent l="0" t="0" r="7620" b="0"/>
+            <wp:docPr id="1508648555" name="Picture 1"/>
+            <wp:cNvGraphicFramePr>
+              <a:graphicFrameLocks xmlns:a="http://schemas.openxmlformats.org/drawingml/2006/main" noChangeAspect="1"/>
+            </wp:cNvGraphicFramePr>
+            <a:graphic xmlns:a="http://schemas.openxmlformats.org/drawingml/2006/main">
+              <a:graphicData uri="http://schemas.openxmlformats.org/drawingml/2006/picture">
+                <pic:pic xmlns:pic="http://schemas.openxmlformats.org/drawingml/2006/picture">
+                  <pic:nvPicPr>
+                    <pic:cNvPr id="1508648555" name=""/>
+                    <pic:cNvPicPr/>
+                  </pic:nvPicPr>
+                  <pic:blipFill>
+                    <a:blip r:embed="rId23"/>
+                    <a:stretch>
+                      <a:fillRect/>
+                    </a:stretch>
+                  </pic:blipFill>
+                  <pic:spPr>
+                    <a:xfrm>
+                      <a:off x="0" y="0"/>
+                      <a:ext cx="4528902" cy="5090875"/>
+                    </a:xfrm>
+                    <a:prstGeom prst="rect">
+                      <a:avLst/>
+                    </a:prstGeom>
+                  </pic:spPr>
+                </pic:pic>
+              </a:graphicData>
+            </a:graphic>
+          </wp:inline>
+        </w:drawing>
+      </w:r>
+    </w:p>
+    <w:p>
+      <w:pPr>
+        <w:rPr>
+          <w:rFonts w:ascii="Times New Roman" w:hAnsi="Times New Roman" w:cs="Times New Roman"/>
+          <w:sz w:val="44"/>
+          <w:szCs w:val="44"/>
+        </w:rPr>
+      </w:pPr>
+      <w:r>
+        <w:rPr>
+          <w:rFonts w:ascii="Times New Roman" w:hAnsi="Times New Roman" w:cs="Times New Roman"/>
+          <w:sz w:val="44"/>
+          <w:szCs w:val="44"/>
+        </w:rPr>
+        <w:drawing>
+          <wp:inline distT="0" distB="0" distL="0" distR="0" wp14:anchorId="4C092130" wp14:editId="154B1D8F">
+            <wp:extent cx="1600200" cy="1154710"/>
+            <wp:effectExtent l="0" t="0" r="0" b="7620"/>
+            <wp:docPr id="640450004" name="Picture 1"/>
+            <wp:cNvGraphicFramePr>
+              <a:graphicFrameLocks xmlns:a="http://schemas.openxmlformats.org/drawingml/2006/main" noChangeAspect="1"/>
+            </wp:cNvGraphicFramePr>
+            <a:graphic xmlns:a="http://schemas.openxmlformats.org/drawingml/2006/main">
+              <a:graphicData uri="http://schemas.openxmlformats.org/drawingml/2006/picture">
+                <pic:pic xmlns:pic="http://schemas.openxmlformats.org/drawingml/2006/picture">
+                  <pic:nvPicPr>
+                    <pic:cNvPr id="640450004" name=""/>
+                    <pic:cNvPicPr/>
+                  </pic:nvPicPr>
+                  <pic:blipFill>
+                    <a:blip r:embed="rId24"/>
+                    <a:stretch>
+                      <a:fillRect/>
+                    </a:stretch>
+                  </pic:blipFill>
+                  <pic:spPr>
+                    <a:xfrm>
+                      <a:off x="0" y="0"/>
+                      <a:ext cx="1603455" cy="1157059"/>
+                    </a:xfrm>
+                    <a:prstGeom prst="rect">
+                      <a:avLst/>
+                    </a:prstGeom>
+                  </pic:spPr>
+                </pic:pic>
+              </a:graphicData>
+            </a:graphic>
+          </wp:inline>
+        </w:drawing>
+      </w:r>
+      <w:r>
+        <w:rPr>
+          <w:rFonts w:ascii="Times New Roman" w:hAnsi="Times New Roman" w:cs="Times New Roman"/>
+          <w:sz w:val="44"/>
+          <w:szCs w:val="44"/>
+        </w:rPr>
         <w:br w:type="page"/>
       </w:r>
     </w:p>
     <w:p>
       <w:pPr>
-        <w:spacing w:after="0"/>
-        <w:rPr>
-          <w:rFonts w:ascii="Times New Roman" w:hAnsi="Times New Roman" w:cs="Times New Roman"/>
-          <w:sz w:val="44"/>
-          <w:szCs w:val="44"/>
-        </w:rPr>
-      </w:pPr>
+        <w:rPr>
+          <w:rFonts w:ascii="Times New Roman" w:hAnsi="Times New Roman" w:cs="Times New Roman"/>
+          <w:sz w:val="44"/>
+          <w:szCs w:val="44"/>
+        </w:rPr>
+      </w:pPr>
+      <w:r>
+        <w:rPr>
+          <w:rFonts w:ascii="Times New Roman" w:hAnsi="Times New Roman" w:cs="Times New Roman"/>
+          <w:b/>
+          <w:bCs/>
+          <w:sz w:val="44"/>
+          <w:szCs w:val="44"/>
+        </w:rPr>
+        <w:lastRenderedPageBreak/>
+        <w:t>Soal 9</w:t>
+      </w:r>
+    </w:p>
+    <w:p>
+      <w:pPr>
+        <w:rPr>
+          <w:rFonts w:ascii="Times New Roman" w:hAnsi="Times New Roman" w:cs="Times New Roman"/>
+          <w:sz w:val="44"/>
+          <w:szCs w:val="44"/>
+        </w:rPr>
+      </w:pPr>
+      <w:r>
+        <w:rPr>
+          <w:rFonts w:ascii="Times New Roman" w:hAnsi="Times New Roman" w:cs="Times New Roman"/>
+          <w:sz w:val="44"/>
+          <w:szCs w:val="44"/>
+        </w:rPr>
+        <w:drawing>
+          <wp:inline distT="0" distB="0" distL="0" distR="0" wp14:anchorId="156CDCB4" wp14:editId="5B82B0D7">
+            <wp:extent cx="4896343" cy="4682067"/>
+            <wp:effectExtent l="0" t="0" r="0" b="4445"/>
+            <wp:docPr id="1224108183" name="Picture 1"/>
+            <wp:cNvGraphicFramePr>
+              <a:graphicFrameLocks xmlns:a="http://schemas.openxmlformats.org/drawingml/2006/main" noChangeAspect="1"/>
+            </wp:cNvGraphicFramePr>
+            <a:graphic xmlns:a="http://schemas.openxmlformats.org/drawingml/2006/main">
+              <a:graphicData uri="http://schemas.openxmlformats.org/drawingml/2006/picture">
+                <pic:pic xmlns:pic="http://schemas.openxmlformats.org/drawingml/2006/picture">
+                  <pic:nvPicPr>
+                    <pic:cNvPr id="1224108183" name=""/>
+                    <pic:cNvPicPr/>
+                  </pic:nvPicPr>
+                  <pic:blipFill>
+                    <a:blip r:embed="rId25"/>
+                    <a:stretch>
+                      <a:fillRect/>
+                    </a:stretch>
+                  </pic:blipFill>
+                  <pic:spPr>
+                    <a:xfrm>
+                      <a:off x="0" y="0"/>
+                      <a:ext cx="4905675" cy="4690991"/>
+                    </a:xfrm>
+                    <a:prstGeom prst="rect">
+                      <a:avLst/>
+                    </a:prstGeom>
+                  </pic:spPr>
+                </pic:pic>
+              </a:graphicData>
+            </a:graphic>
+          </wp:inline>
+        </w:drawing>
+      </w:r>
+    </w:p>
+    <w:p>
+      <w:pPr>
+        <w:rPr>
+          <w:rFonts w:ascii="Times New Roman" w:hAnsi="Times New Roman" w:cs="Times New Roman"/>
+          <w:sz w:val="44"/>
+          <w:szCs w:val="44"/>
+        </w:rPr>
+      </w:pPr>
+      <w:r>
+        <w:rPr>
+          <w:rFonts w:ascii="Times New Roman" w:hAnsi="Times New Roman" w:cs="Times New Roman"/>
+          <w:sz w:val="44"/>
+          <w:szCs w:val="44"/>
+        </w:rPr>
+        <w:drawing>
+          <wp:inline distT="0" distB="0" distL="0" distR="0" wp14:anchorId="5FE2664C" wp14:editId="66BBF3CF">
+            <wp:extent cx="4559300" cy="2220795"/>
+            <wp:effectExtent l="0" t="0" r="0" b="8255"/>
+            <wp:docPr id="1309247092" name="Picture 1"/>
+            <wp:cNvGraphicFramePr>
+              <a:graphicFrameLocks xmlns:a="http://schemas.openxmlformats.org/drawingml/2006/main" noChangeAspect="1"/>
+            </wp:cNvGraphicFramePr>
+            <a:graphic xmlns:a="http://schemas.openxmlformats.org/drawingml/2006/main">
+              <a:graphicData uri="http://schemas.openxmlformats.org/drawingml/2006/picture">
+                <pic:pic xmlns:pic="http://schemas.openxmlformats.org/drawingml/2006/picture">
+                  <pic:nvPicPr>
+                    <pic:cNvPr id="1309247092" name=""/>
+                    <pic:cNvPicPr/>
+                  </pic:nvPicPr>
+                  <pic:blipFill>
+                    <a:blip r:embed="rId26"/>
+                    <a:stretch>
+                      <a:fillRect/>
+                    </a:stretch>
+                  </pic:blipFill>
+                  <pic:spPr>
+                    <a:xfrm>
+                      <a:off x="0" y="0"/>
+                      <a:ext cx="4561581" cy="2221906"/>
+                    </a:xfrm>
+                    <a:prstGeom prst="rect">
+                      <a:avLst/>
+                    </a:prstGeom>
+                  </pic:spPr>
+                </pic:pic>
+              </a:graphicData>
+            </a:graphic>
+          </wp:inline>
+        </w:drawing>
+      </w:r>
     </w:p>
     <w:p>
       <w:pPr>
@@ -1780,40 +2015,127 @@
     </w:p>
     <w:p>
       <w:pPr>
-        <w:spacing w:after="0"/>
-        <w:rPr>
-          <w:rFonts w:ascii="Times New Roman" w:hAnsi="Times New Roman" w:cs="Times New Roman"/>
-          <w:sz w:val="44"/>
-          <w:szCs w:val="44"/>
-        </w:rPr>
-      </w:pPr>
-    </w:p>
-    <w:p>
-      <w:pPr>
-        <w:rPr>
-          <w:rFonts w:ascii="Times New Roman" w:hAnsi="Times New Roman" w:cs="Times New Roman"/>
-          <w:sz w:val="44"/>
-          <w:szCs w:val="44"/>
-        </w:rPr>
-      </w:pPr>
-      <w:r>
-        <w:rPr>
-          <w:rFonts w:ascii="Times New Roman" w:hAnsi="Times New Roman" w:cs="Times New Roman"/>
-          <w:sz w:val="44"/>
-          <w:szCs w:val="44"/>
-        </w:rPr>
-        <w:br w:type="page"/>
-      </w:r>
-    </w:p>
-    <w:p>
-      <w:pPr>
-        <w:spacing w:after="0"/>
-        <w:rPr>
-          <w:rFonts w:ascii="Times New Roman" w:hAnsi="Times New Roman" w:cs="Times New Roman"/>
-          <w:sz w:val="44"/>
-          <w:szCs w:val="44"/>
-        </w:rPr>
-      </w:pPr>
+        <w:rPr>
+          <w:rFonts w:ascii="Times New Roman" w:hAnsi="Times New Roman" w:cs="Times New Roman"/>
+          <w:b/>
+          <w:bCs/>
+          <w:sz w:val="44"/>
+          <w:szCs w:val="44"/>
+        </w:rPr>
+      </w:pPr>
+      <w:r>
+        <w:rPr>
+          <w:rFonts w:ascii="Times New Roman" w:hAnsi="Times New Roman" w:cs="Times New Roman"/>
+          <w:b/>
+          <w:bCs/>
+          <w:sz w:val="44"/>
+          <w:szCs w:val="44"/>
+        </w:rPr>
+        <w:lastRenderedPageBreak/>
+        <w:t>Soal 10</w:t>
+      </w:r>
+    </w:p>
+    <w:p>
+      <w:pPr>
+        <w:rPr>
+          <w:rFonts w:ascii="Times New Roman" w:hAnsi="Times New Roman" w:cs="Times New Roman"/>
+          <w:sz w:val="44"/>
+          <w:szCs w:val="44"/>
+        </w:rPr>
+      </w:pPr>
+      <w:r>
+        <w:rPr>
+          <w:rFonts w:ascii="Times New Roman" w:hAnsi="Times New Roman" w:cs="Times New Roman"/>
+          <w:sz w:val="44"/>
+          <w:szCs w:val="44"/>
+        </w:rPr>
+        <w:drawing>
+          <wp:inline distT="0" distB="0" distL="0" distR="0" wp14:anchorId="0274A70F" wp14:editId="47B2DBB1">
+            <wp:extent cx="3568700" cy="5033978"/>
+            <wp:effectExtent l="0" t="0" r="0" b="0"/>
+            <wp:docPr id="1296493473" name="Picture 1"/>
+            <wp:cNvGraphicFramePr>
+              <a:graphicFrameLocks xmlns:a="http://schemas.openxmlformats.org/drawingml/2006/main" noChangeAspect="1"/>
+            </wp:cNvGraphicFramePr>
+            <a:graphic xmlns:a="http://schemas.openxmlformats.org/drawingml/2006/main">
+              <a:graphicData uri="http://schemas.openxmlformats.org/drawingml/2006/picture">
+                <pic:pic xmlns:pic="http://schemas.openxmlformats.org/drawingml/2006/picture">
+                  <pic:nvPicPr>
+                    <pic:cNvPr id="1296493473" name=""/>
+                    <pic:cNvPicPr/>
+                  </pic:nvPicPr>
+                  <pic:blipFill>
+                    <a:blip r:embed="rId27"/>
+                    <a:stretch>
+                      <a:fillRect/>
+                    </a:stretch>
+                  </pic:blipFill>
+                  <pic:spPr>
+                    <a:xfrm>
+                      <a:off x="0" y="0"/>
+                      <a:ext cx="3571869" cy="5038448"/>
+                    </a:xfrm>
+                    <a:prstGeom prst="rect">
+                      <a:avLst/>
+                    </a:prstGeom>
+                  </pic:spPr>
+                </pic:pic>
+              </a:graphicData>
+            </a:graphic>
+          </wp:inline>
+        </w:drawing>
+      </w:r>
+    </w:p>
+    <w:p>
+      <w:pPr>
+        <w:rPr>
+          <w:rFonts w:ascii="Times New Roman" w:hAnsi="Times New Roman" w:cs="Times New Roman"/>
+          <w:sz w:val="44"/>
+          <w:szCs w:val="44"/>
+        </w:rPr>
+      </w:pPr>
+      <w:r>
+        <w:rPr>
+          <w:rFonts w:ascii="Times New Roman" w:hAnsi="Times New Roman" w:cs="Times New Roman"/>
+          <w:sz w:val="44"/>
+          <w:szCs w:val="44"/>
+        </w:rPr>
+        <w:drawing>
+          <wp:inline distT="0" distB="0" distL="0" distR="0" wp14:anchorId="435659A9" wp14:editId="62BA721F">
+            <wp:extent cx="4925112" cy="2695951"/>
+            <wp:effectExtent l="0" t="0" r="8890" b="9525"/>
+            <wp:docPr id="883355331" name="Picture 1"/>
+            <wp:cNvGraphicFramePr>
+              <a:graphicFrameLocks xmlns:a="http://schemas.openxmlformats.org/drawingml/2006/main" noChangeAspect="1"/>
+            </wp:cNvGraphicFramePr>
+            <a:graphic xmlns:a="http://schemas.openxmlformats.org/drawingml/2006/main">
+              <a:graphicData uri="http://schemas.openxmlformats.org/drawingml/2006/picture">
+                <pic:pic xmlns:pic="http://schemas.openxmlformats.org/drawingml/2006/picture">
+                  <pic:nvPicPr>
+                    <pic:cNvPr id="883355331" name=""/>
+                    <pic:cNvPicPr/>
+                  </pic:nvPicPr>
+                  <pic:blipFill>
+                    <a:blip r:embed="rId28"/>
+                    <a:stretch>
+                      <a:fillRect/>
+                    </a:stretch>
+                  </pic:blipFill>
+                  <pic:spPr>
+                    <a:xfrm>
+                      <a:off x="0" y="0"/>
+                      <a:ext cx="4925112" cy="2695951"/>
+                    </a:xfrm>
+                    <a:prstGeom prst="rect">
+                      <a:avLst/>
+                    </a:prstGeom>
+                  </pic:spPr>
+                </pic:pic>
+              </a:graphicData>
+            </a:graphic>
+          </wp:inline>
+        </w:drawing>
+      </w:r>
     </w:p>
     <w:sectPr>
       <w:pgSz w:w="11906" w:h="16838"/>

</xml_diff>